<commit_message>
updated template for populated comments
</commit_message>
<xml_diff>
--- a/app/templates/multistop_bol_template.docx
+++ b/app/templates/multistop_bol_template.docx
@@ -2771,117 +2771,17 @@
             </w:pPr>
             <w:r>
               <w:rPr>
-                <w:rFonts w:ascii="Times New Roman" w:eastAsia="Times New Roman" w:hAnsi="Times New Roman" w:cs="Times New Roman"/>
+                <w:rFonts w:ascii="Arial" w:eastAsia="Times New Roman" w:hAnsi="Arial" w:cs="Arial"/>
                 <w:b/>
                 <w:bCs/>
                 <w:noProof/>
-                <w:sz w:val="20"/>
-                <w:szCs w:val="20"/>
+                <w:sz w:val="18"/>
+                <w:szCs w:val="18"/>
               </w:rPr>
               <mc:AlternateContent>
                 <mc:Choice Requires="wps">
                   <w:drawing>
-                    <wp:anchor distT="0" distB="0" distL="114300" distR="114300" simplePos="0" relativeHeight="251715584" behindDoc="0" locked="0" layoutInCell="1" allowOverlap="1" wp14:anchorId="31A4CF23" wp14:editId="187974BA">
-                      <wp:simplePos x="0" y="0"/>
-                      <wp:positionH relativeFrom="column">
-                        <wp:posOffset>-150495</wp:posOffset>
-                      </wp:positionH>
-                      <wp:positionV relativeFrom="paragraph">
-                        <wp:posOffset>-233045</wp:posOffset>
-                      </wp:positionV>
-                      <wp:extent cx="2165985" cy="220345"/>
-                      <wp:effectExtent l="0" t="0" r="5715" b="0"/>
-                      <wp:wrapNone/>
-                      <wp:docPr id="1457879966" name="Text Box 3"/>
-                      <wp:cNvGraphicFramePr/>
-                      <a:graphic xmlns:a="http://schemas.openxmlformats.org/drawingml/2006/main">
-                        <a:graphicData uri="http://schemas.microsoft.com/office/word/2010/wordprocessingShape">
-                          <wps:wsp>
-                            <wps:cNvSpPr txBox="1"/>
-                            <wps:spPr>
-                              <a:xfrm>
-                                <a:off x="0" y="0"/>
-                                <a:ext cx="2165985" cy="220345"/>
-                              </a:xfrm>
-                              <a:prstGeom prst="rect">
-                                <a:avLst/>
-                              </a:prstGeom>
-                              <a:solidFill>
-                                <a:schemeClr val="lt1"/>
-                              </a:solidFill>
-                              <a:ln w="6350">
-                                <a:noFill/>
-                              </a:ln>
-                            </wps:spPr>
-                            <wps:txbx>
-                              <w:txbxContent>
-                                <w:p>
-                                  <w:pPr>
-                                    <w:rPr>
-                                      <w:rFonts w:ascii="Arial" w:hAnsi="Arial" w:cs="Arial"/>
-                                      <w:b/>
-                                      <w:bCs/>
-                                      <w:sz w:val="18"/>
-                                      <w:szCs w:val="18"/>
-                                    </w:rPr>
-                                  </w:pPr>
-                                </w:p>
-                              </w:txbxContent>
-                            </wps:txbx>
-                            <wps:bodyPr rot="0" spcFirstLastPara="0" vertOverflow="overflow" horzOverflow="overflow" vert="horz" wrap="square" lIns="91440" tIns="45720" rIns="91440" bIns="45720" numCol="1" spcCol="0" rtlCol="0" fromWordArt="0" anchor="t" anchorCtr="0" forceAA="0" compatLnSpc="1">
-                              <a:prstTxWarp prst="textNoShape">
-                                <a:avLst/>
-                              </a:prstTxWarp>
-                              <a:noAutofit/>
-                            </wps:bodyPr>
-                          </wps:wsp>
-                        </a:graphicData>
-                      </a:graphic>
-                      <wp14:sizeRelH relativeFrom="margin">
-                        <wp14:pctWidth>0</wp14:pctWidth>
-                      </wp14:sizeRelH>
-                      <wp14:sizeRelV relativeFrom="margin">
-                        <wp14:pctHeight>0</wp14:pctHeight>
-                      </wp14:sizeRelV>
-                    </wp:anchor>
-                  </w:drawing>
-                </mc:Choice>
-                <mc:Fallback>
-                  <w:pict>
-                    <v:shape w14:anchorId="31A4CF23" id="Text Box 3" o:spid="_x0000_s1028" type="#_x0000_t202" style="position:absolute;left:0;text-align:left;margin-left:-11.85pt;margin-top:-18.35pt;width:170.55pt;height:17.35pt;z-index:251715584;visibility:visible;mso-wrap-style:square;mso-width-percent:0;mso-height-percent:0;mso-wrap-distance-left:9pt;mso-wrap-distance-top:0;mso-wrap-distance-right:9pt;mso-wrap-distance-bottom:0;mso-position-horizontal:absolute;mso-position-horizontal-relative:text;mso-position-vertical:absolute;mso-position-vertical-relative:text;mso-width-percent:0;mso-height-percent:0;mso-width-relative:margin;mso-height-relative:margin;v-text-anchor:top" o:gfxdata="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" fillcolor="white [3201]" stroked="f" strokeweight=".5pt">
-                      <v:textbox>
-                        <w:txbxContent>
-                          <w:p>
-                            <w:pPr>
-                              <w:rPr>
-                                <w:rFonts w:ascii="Arial" w:hAnsi="Arial" w:cs="Arial"/>
-                                <w:b/>
-                                <w:bCs/>
-                                <w:sz w:val="18"/>
-                                <w:szCs w:val="18"/>
-                              </w:rPr>
-                            </w:pPr>
-                          </w:p>
-                        </w:txbxContent>
-                      </v:textbox>
-                    </v:shape>
-                  </w:pict>
-                </mc:Fallback>
-              </mc:AlternateContent>
-            </w:r>
-            <w:r>
-              <w:rPr>
-                <w:rFonts w:ascii="Arial" w:eastAsia="Times New Roman" w:hAnsi="Arial" w:cs="Arial"/>
-                <w:b/>
-                <w:bCs/>
-                <w:noProof/>
-                <w:sz w:val="18"/>
-                <w:szCs w:val="18"/>
-              </w:rPr>
-              <mc:AlternateContent>
-                <mc:Choice Requires="wps">
-                  <w:drawing>
-                    <wp:anchor distT="0" distB="0" distL="114300" distR="114300" simplePos="0" relativeHeight="251714560" behindDoc="0" locked="0" layoutInCell="1" allowOverlap="1" wp14:anchorId="3C9EB435" wp14:editId="19070F15">
+                    <wp:anchor distT="0" distB="0" distL="114300" distR="114300" simplePos="0" relativeHeight="251714560" behindDoc="0" locked="0" layoutInCell="1" allowOverlap="1" wp14:anchorId="3C9EB435" wp14:editId="35BDAC9B">
                       <wp:simplePos x="0" y="0"/>
                       <wp:positionH relativeFrom="column">
                         <wp:posOffset>-142875</wp:posOffset>
@@ -2946,7 +2846,7 @@
                 </mc:Choice>
                 <mc:Fallback>
                   <w:pict>
-                    <v:shape w14:anchorId="3C9EB435" id="Text Box 2" o:spid="_x0000_s1029" type="#_x0000_t202" style="position:absolute;left:0;text-align:left;margin-left:-11.25pt;margin-top:-34.55pt;width:119.15pt;height:21.1pt;z-index:251714560;visibility:visible;mso-wrap-style:square;mso-width-percent:0;mso-height-percent:0;mso-wrap-distance-left:9pt;mso-wrap-distance-top:0;mso-wrap-distance-right:9pt;mso-wrap-distance-bottom:0;mso-position-horizontal:absolute;mso-position-horizontal-relative:text;mso-position-vertical:absolute;mso-position-vertical-relative:text;mso-width-percent:0;mso-height-percent:0;mso-width-relative:margin;mso-height-relative:margin;v-text-anchor:top" o:gfxdata="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" fillcolor="white [3201]" stroked="f" strokeweight=".5pt">
+                    <v:shape w14:anchorId="3C9EB435" id="Text Box 2" o:spid="_x0000_s1028" type="#_x0000_t202" style="position:absolute;left:0;text-align:left;margin-left:-11.25pt;margin-top:-34.55pt;width:119.15pt;height:21.1pt;z-index:251714560;visibility:visible;mso-wrap-style:square;mso-width-percent:0;mso-height-percent:0;mso-wrap-distance-left:9pt;mso-wrap-distance-top:0;mso-wrap-distance-right:9pt;mso-wrap-distance-bottom:0;mso-position-horizontal:absolute;mso-position-horizontal-relative:text;mso-position-vertical:absolute;mso-position-vertical-relative:text;mso-width-percent:0;mso-height-percent:0;mso-width-relative:margin;mso-height-relative:margin;v-text-anchor:top" o:gfxdata="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" fillcolor="white [3201]" stroked="f" strokeweight=".5pt">
                       <v:textbox>
                         <w:txbxContent>
                           <w:p>
@@ -4633,7 +4533,7 @@
                 </mc:Choice>
                 <mc:Fallback>
                   <w:pict>
-                    <v:shape w14:anchorId="4FE1FF4F" id="Text Box 5" o:spid="_x0000_s1030" type="#_x0000_t202" style="position:absolute;margin-left:-9pt;margin-top:10.75pt;width:277.5pt;height:49.5pt;z-index:251699200;visibility:visible;mso-wrap-style:square;mso-width-percent:0;mso-height-percent:0;mso-wrap-distance-left:9pt;mso-wrap-distance-top:0;mso-wrap-distance-right:9pt;mso-wrap-distance-bottom:0;mso-position-horizontal:absolute;mso-position-horizontal-relative:text;mso-position-vertical:absolute;mso-position-vertical-relative:text;mso-width-percent:0;mso-height-percent:0;mso-width-relative:page;mso-height-relative:page;v-text-anchor:top" o:gfxdata="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" filled="f" stroked="f">
+                    <v:shape w14:anchorId="4FE1FF4F" id="Text Box 5" o:spid="_x0000_s1029" type="#_x0000_t202" style="position:absolute;margin-left:-9pt;margin-top:10.75pt;width:277.5pt;height:49.5pt;z-index:251699200;visibility:visible;mso-wrap-style:square;mso-width-percent:0;mso-height-percent:0;mso-wrap-distance-left:9pt;mso-wrap-distance-top:0;mso-wrap-distance-right:9pt;mso-wrap-distance-bottom:0;mso-position-horizontal:absolute;mso-position-horizontal-relative:text;mso-position-vertical:absolute;mso-position-vertical-relative:text;mso-width-percent:0;mso-height-percent:0;mso-width-relative:page;mso-height-relative:page;v-text-anchor:top" o:gfxdata="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" filled="f" stroked="f">
                       <v:textbox>
                         <w:txbxContent>
                           <w:p>
@@ -4917,7 +4817,7 @@
                 </mc:Choice>
                 <mc:Fallback>
                   <w:pict>
-                    <v:shape w14:anchorId="5338AE4E" id="_x0000_s1031" type="#_x0000_t202" style="position:absolute;left:0;text-align:left;margin-left:327.45pt;margin-top:1.65pt;width:3in;height:19.2pt;z-index:251712512;visibility:visible;mso-wrap-style:square;mso-width-percent:0;mso-height-percent:0;mso-wrap-distance-left:9pt;mso-wrap-distance-top:0;mso-wrap-distance-right:9pt;mso-wrap-distance-bottom:0;mso-position-horizontal:absolute;mso-position-horizontal-relative:text;mso-position-vertical:absolute;mso-position-vertical-relative:text;mso-width-percent:0;mso-height-percent:0;mso-width-relative:margin;mso-height-relative:margin;v-text-anchor:top" o:gfxdata="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" fillcolor="white [3201]" stroked="f" strokeweight=".5pt">
+                    <v:shape w14:anchorId="5338AE4E" id="_x0000_s1030" type="#_x0000_t202" style="position:absolute;left:0;text-align:left;margin-left:327.45pt;margin-top:1.65pt;width:3in;height:19.2pt;z-index:251712512;visibility:visible;mso-wrap-style:square;mso-width-percent:0;mso-height-percent:0;mso-wrap-distance-left:9pt;mso-wrap-distance-top:0;mso-wrap-distance-right:9pt;mso-wrap-distance-bottom:0;mso-position-horizontal:absolute;mso-position-horizontal-relative:text;mso-position-vertical:absolute;mso-position-vertical-relative:text;mso-width-percent:0;mso-height-percent:0;mso-width-relative:margin;mso-height-relative:margin;v-text-anchor:top" o:gfxdata="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" fillcolor="white [3201]" stroked="f" strokeweight=".5pt">
                       <v:textbox>
                         <w:txbxContent>
                           <w:p>
@@ -5059,7 +4959,7 @@
                 </mc:Choice>
                 <mc:Fallback>
                   <w:pict>
-                    <v:shape w14:anchorId="0B3EBB1B" id="Text Box 7" o:spid="_x0000_s1032" type="#_x0000_t202" style="position:absolute;left:0;text-align:left;margin-left:-9.1pt;margin-top:27.3pt;width:585.8pt;height:71.25pt;z-index:251697152;visibility:visible;mso-wrap-style:square;mso-width-percent:0;mso-height-percent:0;mso-wrap-distance-left:9pt;mso-wrap-distance-top:0;mso-wrap-distance-right:9pt;mso-wrap-distance-bottom:0;mso-position-horizontal:absolute;mso-position-horizontal-relative:text;mso-position-vertical:absolute;mso-position-vertical-relative:text;mso-width-percent:0;mso-height-percent:0;mso-width-relative:page;mso-height-relative:page;v-text-anchor:top" o:gfxdata="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" filled="f" fillcolor="white [3201]" stroked="f">
+                    <v:shape w14:anchorId="0B3EBB1B" id="Text Box 7" o:spid="_x0000_s1031" type="#_x0000_t202" style="position:absolute;left:0;text-align:left;margin-left:-9.1pt;margin-top:27.3pt;width:585.8pt;height:71.25pt;z-index:251697152;visibility:visible;mso-wrap-style:square;mso-width-percent:0;mso-height-percent:0;mso-wrap-distance-left:9pt;mso-wrap-distance-top:0;mso-wrap-distance-right:9pt;mso-wrap-distance-bottom:0;mso-position-horizontal:absolute;mso-position-horizontal-relative:text;mso-position-vertical:absolute;mso-position-vertical-relative:text;mso-width-percent:0;mso-height-percent:0;mso-width-relative:page;mso-height-relative:page;v-text-anchor:top" o:gfxdata="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" filled="f" fillcolor="white [3201]" stroked="f">
                       <v:path arrowok="t"/>
                       <v:textbox>
                         <w:txbxContent>
@@ -8221,7 +8121,7 @@
                 </mc:Choice>
                 <mc:Fallback>
                   <w:pict>
-                    <v:shape w14:anchorId="16A30F03" id="Text Box 37" o:spid="_x0000_s1033" type="#_x0000_t202" style="position:absolute;margin-left:-425.75pt;margin-top:1.25pt;width:581.8pt;height:21.1pt;z-index:251709440;visibility:visible;mso-wrap-style:square;mso-width-percent:0;mso-height-percent:0;mso-wrap-distance-left:9pt;mso-wrap-distance-top:0;mso-wrap-distance-right:9pt;mso-wrap-distance-bottom:0;mso-position-horizontal:absolute;mso-position-horizontal-relative:text;mso-position-vertical:absolute;mso-position-vertical-relative:text;mso-width-percent:0;mso-height-percent:0;mso-width-relative:page;mso-height-relative:page;v-text-anchor:top" o:gfxdata="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" filled="f" fillcolor="white [3201]" stroked="f">
+                    <v:shape w14:anchorId="16A30F03" id="Text Box 37" o:spid="_x0000_s1032" type="#_x0000_t202" style="position:absolute;margin-left:-425.75pt;margin-top:1.25pt;width:581.8pt;height:21.1pt;z-index:251709440;visibility:visible;mso-wrap-style:square;mso-width-percent:0;mso-height-percent:0;mso-wrap-distance-left:9pt;mso-wrap-distance-top:0;mso-wrap-distance-right:9pt;mso-wrap-distance-bottom:0;mso-position-horizontal:absolute;mso-position-horizontal-relative:text;mso-position-vertical:absolute;mso-position-vertical-relative:text;mso-width-percent:0;mso-height-percent:0;mso-width-relative:page;mso-height-relative:page;v-text-anchor:top" o:gfxdata="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" filled="f" fillcolor="white [3201]" stroked="f">
                       <v:path arrowok="t"/>
                       <v:textbox>
                         <w:txbxContent>
@@ -8444,7 +8344,7 @@
           </mc:Choice>
           <mc:Fallback>
             <w:pict>
-              <v:shape w14:anchorId="3DBAF4ED" id="_x0000_s1034" type="#_x0000_t202" style="position:absolute;margin-left:0;margin-top:3.5pt;width:566.3pt;height:32.35pt;z-index:251691008;visibility:visible;mso-wrap-style:square;mso-width-percent:0;mso-height-percent:0;mso-wrap-distance-left:9pt;mso-wrap-distance-top:0;mso-wrap-distance-right:9pt;mso-wrap-distance-bottom:0;mso-position-horizontal:absolute;mso-position-horizontal-relative:text;mso-position-vertical:absolute;mso-position-vertical-relative:text;mso-width-percent:0;mso-height-percent:0;mso-width-relative:page;mso-height-relative:page;v-text-anchor:top" o:gfxdata="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" filled="f" stroked="f">
+              <v:shape w14:anchorId="3DBAF4ED" id="_x0000_s1033" type="#_x0000_t202" style="position:absolute;margin-left:0;margin-top:3.5pt;width:566.3pt;height:32.35pt;z-index:251691008;visibility:visible;mso-wrap-style:square;mso-width-percent:0;mso-height-percent:0;mso-wrap-distance-left:9pt;mso-wrap-distance-top:0;mso-wrap-distance-right:9pt;mso-wrap-distance-bottom:0;mso-position-horizontal:absolute;mso-position-horizontal-relative:text;mso-position-vertical:absolute;mso-position-vertical-relative:text;mso-width-percent:0;mso-height-percent:0;mso-width-relative:page;mso-height-relative:page;v-text-anchor:top" o:gfxdata="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" filled="f" stroked="f">
                 <v:textbox>
                   <w:txbxContent>
                     <w:p>

</xml_diff>